<commit_message>
Add code/equation/heading-caps style options and reportifyr config sync (#29)
Style YAML gains code:/equation:/heading.all_caps for fenced-code-block,
equation-font, and all-caps-heading styling, wiring up fonts.monospace
(previously parsed but never applied). Equation font is applied
post-render via apply-layout since pandoc's docx writer drops a
reference-doc's own m:mathPr. New styling_sync_reportifyr_config()
updates reportifyr's report/config.yaml footnotes_font/footnotes_font_size
to match a style YAML, replacing the manual sync both bundled examples'
config.yaml previously needed.

Co-Authored-By: Claude Sonnet 5 <noreply@anthropic.com>
</commit_message>
<xml_diff>
--- a/inst/templates/org-reference.docx
+++ b/inst/templates/org-reference.docx
@@ -476,6 +476,7 @@
       <w:rFonts w:ascii="Times New Roman" w:hAnsi="Times New Roman" w:cs="Times New Roman" w:eastAsia="Times New Roman"/>
       <w:b/>
       <w:bCs/>
+      <w:caps w:val="0"/>
       <w:color w:val="000000"/>
       <w:sz w:val="32"/>
       <w:szCs w:val="28"/>
@@ -500,6 +501,7 @@
       <w:rFonts w:ascii="Times New Roman" w:hAnsi="Times New Roman" w:cs="Times New Roman" w:eastAsia="Times New Roman"/>
       <w:b/>
       <w:bCs/>
+      <w:caps w:val="0"/>
       <w:color w:val="000000"/>
       <w:sz w:val="28"/>
       <w:szCs w:val="26"/>
@@ -524,6 +526,7 @@
       <w:rFonts w:ascii="Times New Roman" w:hAnsi="Times New Roman" w:cs="Times New Roman" w:eastAsia="Times New Roman"/>
       <w:b/>
       <w:bCs/>
+      <w:caps w:val="0"/>
       <w:color w:val="000000"/>
       <w:sz w:val="24"/>
     </w:rPr>
@@ -550,6 +553,7 @@
       <w:bCs/>
       <w:i/>
       <w:iCs/>
+      <w:caps w:val="0"/>
       <w:color w:val="000000"/>
       <w:sz w:val="22"/>
     </w:rPr>
@@ -573,6 +577,7 @@
     <w:rPr>
       <w:rFonts w:ascii="Times New Roman" w:hAnsi="Times New Roman" w:cs="Times New Roman" w:eastAsia="Times New Roman"/>
       <w:b/>
+      <w:caps w:val="0"/>
       <w:color w:val="000000"/>
       <w:sz w:val="22"/>
     </w:rPr>
@@ -598,6 +603,7 @@
       <w:b/>
       <w:i/>
       <w:iCs/>
+      <w:caps w:val="0"/>
       <w:color w:val="000000"/>
       <w:sz w:val="22"/>
     </w:rPr>
@@ -12228,6 +12234,29 @@
       <w:rFonts w:ascii="Times New Roman" w:hAnsi="Times New Roman" w:cs="Times New Roman" w:eastAsia="Times New Roman"/>
       <w:color w:val="000000"/>
       <w:sz w:val="22"/>
+    </w:rPr>
+  </w:style>
+  <w:style w:type="paragraph" w:customStyle="1" w:styleId="SourceCode">
+    <w:name w:val="Source Code"/>
+    <w:basedOn w:val="Normal"/>
+    <w:pPr>
+      <w:shd w:val="clear" w:color="auto" w:fill="F1F3F5"/>
+      <w:spacing w:before="0" w:after="0"/>
+    </w:pPr>
+    <w:rPr>
+      <w:rFonts w:ascii="Courier New" w:hAnsi="Courier New" w:cs="Courier New" w:eastAsia="Courier New"/>
+      <w:color w:val="000000"/>
+      <w:sz w:val="20"/>
+    </w:rPr>
+  </w:style>
+  <w:style w:type="character" w:customStyle="1" w:styleId="VerbatimChar">
+    <w:name w:val="Verbatim Char"/>
+    <w:basedOn w:val="DefaultParagraphFont"/>
+    <w:rPr>
+      <w:rFonts w:ascii="Courier New" w:hAnsi="Courier New" w:cs="Courier New" w:eastAsia="Courier New"/>
+      <w:color w:val="000000"/>
+      <w:sz w:val="20"/>
+      <w:shd w:val="clear" w:color="auto" w:fill="F1F3F5"/>
     </w:rPr>
   </w:style>
   <w:style w:type="character" w:customStyle="1" w:styleId="Hyperlink">

</xml_diff>